<commit_message>
docs: atualização e correção dos diagramas e modelagem desenvolvidos na Sprint 2: Diagrama de Classe, MER, DER, Infra
</commit_message>
<xml_diff>
--- a/docs/modelagem/mer/GASTRA_MER.docx
+++ b/docs/modelagem/mer/GASTRA_MER.docx
@@ -503,6 +503,9 @@
       <w:r>
         <w:t>status</w:t>
       </w:r>
+      <w:r>
+        <w:t xml:space="preserve"> (aberta | fechada | cancelada)</w:t>
+      </w:r>
     </w:p>
     <w:p>
       <w:pPr>
@@ -806,7 +809,34 @@
       </w:r>
       <w:proofErr w:type="spellEnd"/>
       <w:r>
-        <w:t xml:space="preserve"> (multivalorado)</w:t>
+        <w:t xml:space="preserve"> </w:t>
+      </w:r>
+      <w:r>
+        <w:t xml:space="preserve">(multivalorado; lista fechada: vegano, vegetariano, </w:t>
+      </w:r>
+      <w:proofErr w:type="spellStart"/>
+      <w:r>
+        <w:t>sem_gluten</w:t>
+      </w:r>
+      <w:proofErr w:type="spellEnd"/>
+      <w:r>
+        <w:t xml:space="preserve">, </w:t>
+      </w:r>
+      <w:proofErr w:type="spellStart"/>
+      <w:r>
+        <w:t>sem_lactose</w:t>
+      </w:r>
+      <w:proofErr w:type="spellEnd"/>
+      <w:r>
+        <w:t xml:space="preserve">, </w:t>
+      </w:r>
+      <w:proofErr w:type="spellStart"/>
+      <w:r>
+        <w:t>opcao_infantil</w:t>
+      </w:r>
+      <w:proofErr w:type="spellEnd"/>
+      <w:r>
+        <w:t>)</w:t>
       </w:r>
     </w:p>
     <w:p>
@@ -1207,7 +1237,10 @@
       </w:r>
       <w:proofErr w:type="spellEnd"/>
       <w:r>
-        <w:t xml:space="preserve"> (ex.: almoço/jantar — varia conforme a escala)</w:t>
+        <w:t xml:space="preserve"> </w:t>
+      </w:r>
+      <w:r>
+        <w:t>(almoço | jantar)</w:t>
       </w:r>
     </w:p>
     <w:p>
@@ -1276,6 +1309,7 @@
           <w:b/>
           <w:bCs/>
         </w:rPr>
+        <w:lastRenderedPageBreak/>
         <w:t xml:space="preserve">Entidades envolvidas: </w:t>
       </w:r>
       <w:r>
@@ -1291,7 +1325,6 @@
           <w:b/>
           <w:bCs/>
         </w:rPr>
-        <w:lastRenderedPageBreak/>
         <w:t xml:space="preserve">Regra de negócio: </w:t>
       </w:r>
       <w:r>
@@ -2394,7 +2427,6 @@
   <w:style w:type="character" w:default="1" w:styleId="Fontepargpadro">
     <w:name w:val="Default Paragraph Font"/>
     <w:uiPriority w:val="1"/>
-    <w:semiHidden/>
     <w:unhideWhenUsed/>
   </w:style>
   <w:style w:type="table" w:default="1" w:styleId="Tabelanormal">

</xml_diff>